<commit_message>
Add defense stats and simplify skill database
</commit_message>
<xml_diff>
--- a/게임 스텟 정리표.docx
+++ b/게임 스텟 정리표.docx
@@ -24,11 +24,6 @@
             <w:tcW w:w="1502" w:type="dxa"/>
           </w:tcPr>
           <w:p>
-            <w:pPr>
-              <w:rPr>
-                <w:rFonts w:hint="eastAsia"/>
-              </w:rPr>
-            </w:pPr>
             <w:proofErr w:type="spellStart"/>
             <w:r>
               <w:rPr>
@@ -58,11 +53,6 @@
             <w:tcW w:w="1502" w:type="dxa"/>
           </w:tcPr>
           <w:p>
-            <w:pPr>
-              <w:rPr>
-                <w:rFonts w:hint="eastAsia"/>
-              </w:rPr>
-            </w:pPr>
             <w:r>
               <w:rPr>
                 <w:rFonts w:hint="eastAsia"/>
@@ -76,11 +66,6 @@
             <w:tcW w:w="1503" w:type="dxa"/>
           </w:tcPr>
           <w:p>
-            <w:pPr>
-              <w:rPr>
-                <w:rFonts w:hint="eastAsia"/>
-              </w:rPr>
-            </w:pPr>
             <w:r>
               <w:rPr>
                 <w:rFonts w:hint="eastAsia"/>
@@ -94,11 +79,6 @@
             <w:tcW w:w="1503" w:type="dxa"/>
           </w:tcPr>
           <w:p>
-            <w:pPr>
-              <w:rPr>
-                <w:rFonts w:hint="eastAsia"/>
-              </w:rPr>
-            </w:pPr>
             <w:r>
               <w:rPr>
                 <w:rFonts w:hint="eastAsia"/>
@@ -112,11 +92,6 @@
             <w:tcW w:w="1503" w:type="dxa"/>
           </w:tcPr>
           <w:p>
-            <w:pPr>
-              <w:rPr>
-                <w:rFonts w:hint="eastAsia"/>
-              </w:rPr>
-            </w:pPr>
             <w:r>
               <w:rPr>
                 <w:rFonts w:hint="eastAsia"/>
@@ -130,11 +105,6 @@
             <w:tcW w:w="1503" w:type="dxa"/>
           </w:tcPr>
           <w:p>
-            <w:pPr>
-              <w:rPr>
-                <w:rFonts w:hint="eastAsia"/>
-              </w:rPr>
-            </w:pPr>
             <w:r>
               <w:rPr>
                 <w:rFonts w:hint="eastAsia"/>
@@ -150,11 +120,6 @@
             <w:tcW w:w="1502" w:type="dxa"/>
           </w:tcPr>
           <w:p>
-            <w:pPr>
-              <w:rPr>
-                <w:rFonts w:hint="eastAsia"/>
-              </w:rPr>
-            </w:pPr>
             <w:r>
               <w:rPr>
                 <w:rFonts w:hint="eastAsia"/>
@@ -168,11 +133,6 @@
             <w:tcW w:w="1502" w:type="dxa"/>
           </w:tcPr>
           <w:p>
-            <w:pPr>
-              <w:rPr>
-                <w:rFonts w:hint="eastAsia"/>
-              </w:rPr>
-            </w:pPr>
             <w:r>
               <w:rPr>
                 <w:rFonts w:hint="eastAsia"/>
@@ -186,11 +146,6 @@
             <w:tcW w:w="1503" w:type="dxa"/>
           </w:tcPr>
           <w:p>
-            <w:pPr>
-              <w:rPr>
-                <w:rFonts w:hint="eastAsia"/>
-              </w:rPr>
-            </w:pPr>
             <w:r>
               <w:rPr>
                 <w:rFonts w:hint="eastAsia"/>
@@ -204,11 +159,6 @@
             <w:tcW w:w="1503" w:type="dxa"/>
           </w:tcPr>
           <w:p>
-            <w:pPr>
-              <w:rPr>
-                <w:rFonts w:hint="eastAsia"/>
-              </w:rPr>
-            </w:pPr>
             <w:r>
               <w:rPr>
                 <w:rFonts w:hint="eastAsia"/>
@@ -222,11 +172,6 @@
             <w:tcW w:w="1503" w:type="dxa"/>
           </w:tcPr>
           <w:p>
-            <w:pPr>
-              <w:rPr>
-                <w:rFonts w:hint="eastAsia"/>
-              </w:rPr>
-            </w:pPr>
             <w:r>
               <w:rPr>
                 <w:rFonts w:hint="eastAsia"/>
@@ -240,11 +185,6 @@
             <w:tcW w:w="1503" w:type="dxa"/>
           </w:tcPr>
           <w:p>
-            <w:pPr>
-              <w:rPr>
-                <w:rFonts w:hint="eastAsia"/>
-              </w:rPr>
-            </w:pPr>
             <w:r>
               <w:rPr>
                 <w:rFonts w:hint="eastAsia"/>
@@ -260,11 +200,6 @@
             <w:tcW w:w="1502" w:type="dxa"/>
           </w:tcPr>
           <w:p>
-            <w:pPr>
-              <w:rPr>
-                <w:rFonts w:hint="eastAsia"/>
-              </w:rPr>
-            </w:pPr>
             <w:proofErr w:type="spellStart"/>
             <w:r>
               <w:rPr>
@@ -280,11 +215,6 @@
             <w:tcW w:w="1502" w:type="dxa"/>
           </w:tcPr>
           <w:p>
-            <w:pPr>
-              <w:rPr>
-                <w:rFonts w:hint="eastAsia"/>
-              </w:rPr>
-            </w:pPr>
             <w:r>
               <w:rPr>
                 <w:rFonts w:hint="eastAsia"/>
@@ -298,11 +228,6 @@
             <w:tcW w:w="1503" w:type="dxa"/>
           </w:tcPr>
           <w:p>
-            <w:pPr>
-              <w:rPr>
-                <w:rFonts w:hint="eastAsia"/>
-              </w:rPr>
-            </w:pPr>
             <w:r>
               <w:rPr>
                 <w:rFonts w:hint="eastAsia"/>
@@ -316,11 +241,6 @@
             <w:tcW w:w="1503" w:type="dxa"/>
           </w:tcPr>
           <w:p>
-            <w:pPr>
-              <w:rPr>
-                <w:rFonts w:hint="eastAsia"/>
-              </w:rPr>
-            </w:pPr>
             <w:r>
               <w:rPr>
                 <w:rFonts w:hint="eastAsia"/>
@@ -334,11 +254,6 @@
             <w:tcW w:w="1503" w:type="dxa"/>
           </w:tcPr>
           <w:p>
-            <w:pPr>
-              <w:rPr>
-                <w:rFonts w:hint="eastAsia"/>
-              </w:rPr>
-            </w:pPr>
             <w:r>
               <w:rPr>
                 <w:rFonts w:hint="eastAsia"/>
@@ -352,11 +267,6 @@
             <w:tcW w:w="1503" w:type="dxa"/>
           </w:tcPr>
           <w:p>
-            <w:pPr>
-              <w:rPr>
-                <w:rFonts w:hint="eastAsia"/>
-              </w:rPr>
-            </w:pPr>
             <w:r>
               <w:rPr>
                 <w:rFonts w:hint="eastAsia"/>
@@ -372,11 +282,6 @@
             <w:tcW w:w="1502" w:type="dxa"/>
           </w:tcPr>
           <w:p>
-            <w:pPr>
-              <w:rPr>
-                <w:rFonts w:hint="eastAsia"/>
-              </w:rPr>
-            </w:pPr>
             <w:proofErr w:type="spellStart"/>
             <w:r>
               <w:rPr>
@@ -392,11 +297,6 @@
             <w:tcW w:w="1502" w:type="dxa"/>
           </w:tcPr>
           <w:p>
-            <w:pPr>
-              <w:rPr>
-                <w:rFonts w:hint="eastAsia"/>
-              </w:rPr>
-            </w:pPr>
             <w:r>
               <w:rPr>
                 <w:rFonts w:hint="eastAsia"/>
@@ -410,11 +310,6 @@
             <w:tcW w:w="1503" w:type="dxa"/>
           </w:tcPr>
           <w:p>
-            <w:pPr>
-              <w:rPr>
-                <w:rFonts w:hint="eastAsia"/>
-              </w:rPr>
-            </w:pPr>
             <w:r>
               <w:rPr>
                 <w:rFonts w:hint="eastAsia"/>
@@ -428,11 +323,6 @@
             <w:tcW w:w="1503" w:type="dxa"/>
           </w:tcPr>
           <w:p>
-            <w:pPr>
-              <w:rPr>
-                <w:rFonts w:hint="eastAsia"/>
-              </w:rPr>
-            </w:pPr>
             <w:r>
               <w:rPr>
                 <w:rFonts w:hint="eastAsia"/>
@@ -446,11 +336,6 @@
             <w:tcW w:w="1503" w:type="dxa"/>
           </w:tcPr>
           <w:p>
-            <w:pPr>
-              <w:rPr>
-                <w:rFonts w:hint="eastAsia"/>
-              </w:rPr>
-            </w:pPr>
             <w:r>
               <w:rPr>
                 <w:rFonts w:hint="eastAsia"/>
@@ -464,11 +349,6 @@
             <w:tcW w:w="1503" w:type="dxa"/>
           </w:tcPr>
           <w:p>
-            <w:pPr>
-              <w:rPr>
-                <w:rFonts w:hint="eastAsia"/>
-              </w:rPr>
-            </w:pPr>
             <w:r>
               <w:rPr>
                 <w:rFonts w:hint="eastAsia"/>
@@ -484,11 +364,6 @@
             <w:tcW w:w="1502" w:type="dxa"/>
           </w:tcPr>
           <w:p>
-            <w:pPr>
-              <w:rPr>
-                <w:rFonts w:hint="eastAsia"/>
-              </w:rPr>
-            </w:pPr>
             <w:proofErr w:type="spellStart"/>
             <w:r>
               <w:rPr>
@@ -504,11 +379,6 @@
             <w:tcW w:w="1502" w:type="dxa"/>
           </w:tcPr>
           <w:p>
-            <w:pPr>
-              <w:rPr>
-                <w:rFonts w:hint="eastAsia"/>
-              </w:rPr>
-            </w:pPr>
             <w:r>
               <w:rPr>
                 <w:rFonts w:hint="eastAsia"/>
@@ -522,11 +392,6 @@
             <w:tcW w:w="1503" w:type="dxa"/>
           </w:tcPr>
           <w:p>
-            <w:pPr>
-              <w:rPr>
-                <w:rFonts w:hint="eastAsia"/>
-              </w:rPr>
-            </w:pPr>
             <w:r>
               <w:rPr>
                 <w:rFonts w:hint="eastAsia"/>
@@ -540,11 +405,6 @@
             <w:tcW w:w="1503" w:type="dxa"/>
           </w:tcPr>
           <w:p>
-            <w:pPr>
-              <w:rPr>
-                <w:rFonts w:hint="eastAsia"/>
-              </w:rPr>
-            </w:pPr>
             <w:r>
               <w:rPr>
                 <w:rFonts w:hint="eastAsia"/>
@@ -558,11 +418,6 @@
             <w:tcW w:w="1503" w:type="dxa"/>
           </w:tcPr>
           <w:p>
-            <w:pPr>
-              <w:rPr>
-                <w:rFonts w:hint="eastAsia"/>
-              </w:rPr>
-            </w:pPr>
             <w:r>
               <w:rPr>
                 <w:rFonts w:hint="eastAsia"/>
@@ -576,11 +431,6 @@
             <w:tcW w:w="1503" w:type="dxa"/>
           </w:tcPr>
           <w:p>
-            <w:pPr>
-              <w:rPr>
-                <w:rFonts w:hint="eastAsia"/>
-              </w:rPr>
-            </w:pPr>
             <w:r>
               <w:rPr>
                 <w:rFonts w:hint="eastAsia"/>
@@ -612,11 +462,6 @@
             <w:tcW w:w="1502" w:type="dxa"/>
           </w:tcPr>
           <w:p>
-            <w:pPr>
-              <w:rPr>
-                <w:rFonts w:hint="eastAsia"/>
-              </w:rPr>
-            </w:pPr>
             <w:proofErr w:type="spellStart"/>
             <w:r>
               <w:rPr>
@@ -646,11 +491,6 @@
             <w:tcW w:w="1502" w:type="dxa"/>
           </w:tcPr>
           <w:p>
-            <w:pPr>
-              <w:rPr>
-                <w:rFonts w:hint="eastAsia"/>
-              </w:rPr>
-            </w:pPr>
             <w:r>
               <w:rPr>
                 <w:rFonts w:hint="eastAsia"/>
@@ -664,11 +504,6 @@
             <w:tcW w:w="1503" w:type="dxa"/>
           </w:tcPr>
           <w:p>
-            <w:pPr>
-              <w:rPr>
-                <w:rFonts w:hint="eastAsia"/>
-              </w:rPr>
-            </w:pPr>
             <w:r>
               <w:rPr>
                 <w:rFonts w:hint="eastAsia"/>
@@ -682,11 +517,6 @@
             <w:tcW w:w="1503" w:type="dxa"/>
           </w:tcPr>
           <w:p>
-            <w:pPr>
-              <w:rPr>
-                <w:rFonts w:hint="eastAsia"/>
-              </w:rPr>
-            </w:pPr>
             <w:r>
               <w:rPr>
                 <w:rFonts w:hint="eastAsia"/>
@@ -700,11 +530,6 @@
             <w:tcW w:w="1503" w:type="dxa"/>
           </w:tcPr>
           <w:p>
-            <w:pPr>
-              <w:rPr>
-                <w:rFonts w:hint="eastAsia"/>
-              </w:rPr>
-            </w:pPr>
             <w:r>
               <w:rPr>
                 <w:rFonts w:hint="eastAsia"/>
@@ -718,11 +543,6 @@
             <w:tcW w:w="1503" w:type="dxa"/>
           </w:tcPr>
           <w:p>
-            <w:pPr>
-              <w:rPr>
-                <w:rFonts w:hint="eastAsia"/>
-              </w:rPr>
-            </w:pPr>
             <w:r>
               <w:rPr>
                 <w:rFonts w:hint="eastAsia"/>
@@ -738,11 +558,6 @@
             <w:tcW w:w="1502" w:type="dxa"/>
           </w:tcPr>
           <w:p>
-            <w:pPr>
-              <w:rPr>
-                <w:rFonts w:hint="eastAsia"/>
-              </w:rPr>
-            </w:pPr>
             <w:r>
               <w:rPr>
                 <w:rFonts w:hint="eastAsia"/>
@@ -756,11 +571,6 @@
             <w:tcW w:w="1502" w:type="dxa"/>
           </w:tcPr>
           <w:p>
-            <w:pPr>
-              <w:rPr>
-                <w:rFonts w:hint="eastAsia"/>
-              </w:rPr>
-            </w:pPr>
             <w:r>
               <w:rPr>
                 <w:rFonts w:hint="eastAsia"/>
@@ -774,11 +584,6 @@
             <w:tcW w:w="1503" w:type="dxa"/>
           </w:tcPr>
           <w:p>
-            <w:pPr>
-              <w:rPr>
-                <w:rFonts w:hint="eastAsia"/>
-              </w:rPr>
-            </w:pPr>
             <w:r>
               <w:rPr>
                 <w:rFonts w:hint="eastAsia"/>
@@ -792,11 +597,6 @@
             <w:tcW w:w="1503" w:type="dxa"/>
           </w:tcPr>
           <w:p>
-            <w:pPr>
-              <w:rPr>
-                <w:rFonts w:hint="eastAsia"/>
-              </w:rPr>
-            </w:pPr>
             <w:r>
               <w:rPr>
                 <w:rFonts w:hint="eastAsia"/>
@@ -810,11 +610,6 @@
             <w:tcW w:w="1503" w:type="dxa"/>
           </w:tcPr>
           <w:p>
-            <w:pPr>
-              <w:rPr>
-                <w:rFonts w:hint="eastAsia"/>
-              </w:rPr>
-            </w:pPr>
             <w:r>
               <w:rPr>
                 <w:rFonts w:hint="eastAsia"/>
@@ -828,11 +623,6 @@
             <w:tcW w:w="1503" w:type="dxa"/>
           </w:tcPr>
           <w:p>
-            <w:pPr>
-              <w:rPr>
-                <w:rFonts w:hint="eastAsia"/>
-              </w:rPr>
-            </w:pPr>
             <w:r>
               <w:rPr>
                 <w:rFonts w:hint="eastAsia"/>
@@ -848,11 +638,6 @@
             <w:tcW w:w="1502" w:type="dxa"/>
           </w:tcPr>
           <w:p>
-            <w:pPr>
-              <w:rPr>
-                <w:rFonts w:hint="eastAsia"/>
-              </w:rPr>
-            </w:pPr>
             <w:r>
               <w:rPr>
                 <w:rFonts w:hint="eastAsia"/>
@@ -866,11 +651,6 @@
             <w:tcW w:w="1502" w:type="dxa"/>
           </w:tcPr>
           <w:p>
-            <w:pPr>
-              <w:rPr>
-                <w:rFonts w:hint="eastAsia"/>
-              </w:rPr>
-            </w:pPr>
             <w:r>
               <w:rPr>
                 <w:rFonts w:hint="eastAsia"/>
@@ -884,11 +664,6 @@
             <w:tcW w:w="1503" w:type="dxa"/>
           </w:tcPr>
           <w:p>
-            <w:pPr>
-              <w:rPr>
-                <w:rFonts w:hint="eastAsia"/>
-              </w:rPr>
-            </w:pPr>
             <w:r>
               <w:rPr>
                 <w:rFonts w:hint="eastAsia"/>
@@ -902,11 +677,6 @@
             <w:tcW w:w="1503" w:type="dxa"/>
           </w:tcPr>
           <w:p>
-            <w:pPr>
-              <w:rPr>
-                <w:rFonts w:hint="eastAsia"/>
-              </w:rPr>
-            </w:pPr>
             <w:r>
               <w:rPr>
                 <w:rFonts w:hint="eastAsia"/>
@@ -920,11 +690,6 @@
             <w:tcW w:w="1503" w:type="dxa"/>
           </w:tcPr>
           <w:p>
-            <w:pPr>
-              <w:rPr>
-                <w:rFonts w:hint="eastAsia"/>
-              </w:rPr>
-            </w:pPr>
             <w:r>
               <w:rPr>
                 <w:rFonts w:hint="eastAsia"/>
@@ -938,11 +703,6 @@
             <w:tcW w:w="1503" w:type="dxa"/>
           </w:tcPr>
           <w:p>
-            <w:pPr>
-              <w:rPr>
-                <w:rFonts w:hint="eastAsia"/>
-              </w:rPr>
-            </w:pPr>
             <w:r>
               <w:rPr>
                 <w:rFonts w:hint="eastAsia"/>
@@ -958,11 +718,6 @@
             <w:tcW w:w="1502" w:type="dxa"/>
           </w:tcPr>
           <w:p>
-            <w:pPr>
-              <w:rPr>
-                <w:rFonts w:hint="eastAsia"/>
-              </w:rPr>
-            </w:pPr>
             <w:r>
               <w:rPr>
                 <w:rFonts w:hint="eastAsia"/>
@@ -976,11 +731,6 @@
             <w:tcW w:w="1502" w:type="dxa"/>
           </w:tcPr>
           <w:p>
-            <w:pPr>
-              <w:rPr>
-                <w:rFonts w:hint="eastAsia"/>
-              </w:rPr>
-            </w:pPr>
             <w:r>
               <w:rPr>
                 <w:rFonts w:hint="eastAsia"/>
@@ -994,11 +744,6 @@
             <w:tcW w:w="1503" w:type="dxa"/>
           </w:tcPr>
           <w:p>
-            <w:pPr>
-              <w:rPr>
-                <w:rFonts w:hint="eastAsia"/>
-              </w:rPr>
-            </w:pPr>
             <w:r>
               <w:rPr>
                 <w:rFonts w:hint="eastAsia"/>
@@ -1012,11 +757,6 @@
             <w:tcW w:w="1503" w:type="dxa"/>
           </w:tcPr>
           <w:p>
-            <w:pPr>
-              <w:rPr>
-                <w:rFonts w:hint="eastAsia"/>
-              </w:rPr>
-            </w:pPr>
             <w:r>
               <w:rPr>
                 <w:rFonts w:hint="eastAsia"/>
@@ -1030,11 +770,6 @@
             <w:tcW w:w="1503" w:type="dxa"/>
           </w:tcPr>
           <w:p>
-            <w:pPr>
-              <w:rPr>
-                <w:rFonts w:hint="eastAsia"/>
-              </w:rPr>
-            </w:pPr>
             <w:r>
               <w:rPr>
                 <w:rFonts w:hint="eastAsia"/>
@@ -1048,11 +783,6 @@
             <w:tcW w:w="1503" w:type="dxa"/>
           </w:tcPr>
           <w:p>
-            <w:pPr>
-              <w:rPr>
-                <w:rFonts w:hint="eastAsia"/>
-              </w:rPr>
-            </w:pPr>
             <w:r>
               <w:rPr>
                 <w:rFonts w:hint="eastAsia"/>
@@ -1068,11 +798,6 @@
             <w:tcW w:w="1502" w:type="dxa"/>
           </w:tcPr>
           <w:p>
-            <w:pPr>
-              <w:rPr>
-                <w:rFonts w:hint="eastAsia"/>
-              </w:rPr>
-            </w:pPr>
             <w:r>
               <w:rPr>
                 <w:rFonts w:hint="eastAsia"/>
@@ -1086,11 +811,6 @@
             <w:tcW w:w="1502" w:type="dxa"/>
           </w:tcPr>
           <w:p>
-            <w:pPr>
-              <w:rPr>
-                <w:rFonts w:hint="eastAsia"/>
-              </w:rPr>
-            </w:pPr>
             <w:r>
               <w:rPr>
                 <w:rFonts w:hint="eastAsia"/>
@@ -1104,11 +824,6 @@
             <w:tcW w:w="1503" w:type="dxa"/>
           </w:tcPr>
           <w:p>
-            <w:pPr>
-              <w:rPr>
-                <w:rFonts w:hint="eastAsia"/>
-              </w:rPr>
-            </w:pPr>
             <w:r>
               <w:rPr>
                 <w:rFonts w:hint="eastAsia"/>
@@ -1122,11 +837,6 @@
             <w:tcW w:w="1503" w:type="dxa"/>
           </w:tcPr>
           <w:p>
-            <w:pPr>
-              <w:rPr>
-                <w:rFonts w:hint="eastAsia"/>
-              </w:rPr>
-            </w:pPr>
             <w:r>
               <w:rPr>
                 <w:rFonts w:hint="eastAsia"/>
@@ -1140,11 +850,6 @@
             <w:tcW w:w="1503" w:type="dxa"/>
           </w:tcPr>
           <w:p>
-            <w:pPr>
-              <w:rPr>
-                <w:rFonts w:hint="eastAsia"/>
-              </w:rPr>
-            </w:pPr>
             <w:r>
               <w:rPr>
                 <w:rFonts w:hint="eastAsia"/>
@@ -1158,11 +863,6 @@
             <w:tcW w:w="1503" w:type="dxa"/>
           </w:tcPr>
           <w:p>
-            <w:pPr>
-              <w:rPr>
-                <w:rFonts w:hint="eastAsia"/>
-              </w:rPr>
-            </w:pPr>
             <w:r>
               <w:rPr>
                 <w:rFonts w:hint="eastAsia"/>
@@ -1178,11 +878,6 @@
             <w:tcW w:w="1502" w:type="dxa"/>
           </w:tcPr>
           <w:p>
-            <w:pPr>
-              <w:rPr>
-                <w:rFonts w:hint="eastAsia"/>
-              </w:rPr>
-            </w:pPr>
             <w:r>
               <w:rPr>
                 <w:rFonts w:hint="eastAsia"/>
@@ -1196,11 +891,6 @@
             <w:tcW w:w="1502" w:type="dxa"/>
           </w:tcPr>
           <w:p>
-            <w:pPr>
-              <w:rPr>
-                <w:rFonts w:hint="eastAsia"/>
-              </w:rPr>
-            </w:pPr>
             <w:r>
               <w:rPr>
                 <w:rFonts w:hint="eastAsia"/>
@@ -1214,11 +904,6 @@
             <w:tcW w:w="1503" w:type="dxa"/>
           </w:tcPr>
           <w:p>
-            <w:pPr>
-              <w:rPr>
-                <w:rFonts w:hint="eastAsia"/>
-              </w:rPr>
-            </w:pPr>
             <w:r>
               <w:rPr>
                 <w:rFonts w:hint="eastAsia"/>
@@ -1232,11 +917,6 @@
             <w:tcW w:w="1503" w:type="dxa"/>
           </w:tcPr>
           <w:p>
-            <w:pPr>
-              <w:rPr>
-                <w:rFonts w:hint="eastAsia"/>
-              </w:rPr>
-            </w:pPr>
             <w:r>
               <w:rPr>
                 <w:rFonts w:hint="eastAsia"/>
@@ -1250,11 +930,6 @@
             <w:tcW w:w="1503" w:type="dxa"/>
           </w:tcPr>
           <w:p>
-            <w:pPr>
-              <w:rPr>
-                <w:rFonts w:hint="eastAsia"/>
-              </w:rPr>
-            </w:pPr>
             <w:r>
               <w:rPr>
                 <w:rFonts w:hint="eastAsia"/>
@@ -1268,11 +943,6 @@
             <w:tcW w:w="1503" w:type="dxa"/>
           </w:tcPr>
           <w:p>
-            <w:pPr>
-              <w:rPr>
-                <w:rFonts w:hint="eastAsia"/>
-              </w:rPr>
-            </w:pPr>
             <w:r>
               <w:rPr>
                 <w:rFonts w:hint="eastAsia"/>
@@ -1288,11 +958,6 @@
             <w:tcW w:w="1502" w:type="dxa"/>
           </w:tcPr>
           <w:p>
-            <w:pPr>
-              <w:rPr>
-                <w:rFonts w:hint="eastAsia"/>
-              </w:rPr>
-            </w:pPr>
             <w:r>
               <w:rPr>
                 <w:rFonts w:hint="eastAsia"/>
@@ -1306,11 +971,6 @@
             <w:tcW w:w="1502" w:type="dxa"/>
           </w:tcPr>
           <w:p>
-            <w:pPr>
-              <w:rPr>
-                <w:rFonts w:hint="eastAsia"/>
-              </w:rPr>
-            </w:pPr>
             <w:r>
               <w:rPr>
                 <w:rFonts w:hint="eastAsia"/>
@@ -1324,11 +984,6 @@
             <w:tcW w:w="1503" w:type="dxa"/>
           </w:tcPr>
           <w:p>
-            <w:pPr>
-              <w:rPr>
-                <w:rFonts w:hint="eastAsia"/>
-              </w:rPr>
-            </w:pPr>
             <w:r>
               <w:rPr>
                 <w:rFonts w:hint="eastAsia"/>
@@ -1342,11 +997,6 @@
             <w:tcW w:w="1503" w:type="dxa"/>
           </w:tcPr>
           <w:p>
-            <w:pPr>
-              <w:rPr>
-                <w:rFonts w:hint="eastAsia"/>
-              </w:rPr>
-            </w:pPr>
             <w:r>
               <w:rPr>
                 <w:rFonts w:hint="eastAsia"/>
@@ -1360,11 +1010,6 @@
             <w:tcW w:w="1503" w:type="dxa"/>
           </w:tcPr>
           <w:p>
-            <w:pPr>
-              <w:rPr>
-                <w:rFonts w:hint="eastAsia"/>
-              </w:rPr>
-            </w:pPr>
             <w:r>
               <w:rPr>
                 <w:rFonts w:hint="eastAsia"/>
@@ -1378,11 +1023,6 @@
             <w:tcW w:w="1503" w:type="dxa"/>
           </w:tcPr>
           <w:p>
-            <w:pPr>
-              <w:rPr>
-                <w:rFonts w:hint="eastAsia"/>
-              </w:rPr>
-            </w:pPr>
             <w:r>
               <w:rPr>
                 <w:rFonts w:hint="eastAsia"/>
@@ -1534,67 +1174,11 @@
       </w:r>
     </w:p>
     <w:p>
-      <w:pPr>
-        <w:rPr>
-          <w:rFonts w:hint="eastAsia"/>
-        </w:rPr>
-      </w:pPr>
       <w:r>
         <w:rPr>
           <w:rFonts w:hint="eastAsia"/>
         </w:rPr>
         <w:t>주요 능력치: 힘+체력</w:t>
-      </w:r>
-    </w:p>
-    <w:p>
-      <w:pPr>
-        <w:rPr>
-          <w:rFonts w:hint="eastAsia"/>
-        </w:rPr>
-      </w:pPr>
-    </w:p>
-    <w:p>
-      <w:r>
-        <w:rPr>
-          <w:rFonts w:hint="eastAsia"/>
-        </w:rPr>
-        <w:t>요인 사살:</w:t>
-      </w:r>
-    </w:p>
-    <w:p>
-      <w:pPr>
-        <w:rPr>
-          <w:rFonts w:hint="eastAsia"/>
-        </w:rPr>
-      </w:pPr>
-      <w:r>
-        <w:rPr>
-          <w:rFonts w:hint="eastAsia"/>
-        </w:rPr>
-        <w:t>주요 능력치: 힘+민첩</w:t>
-      </w:r>
-    </w:p>
-    <w:p>
-      <w:pPr>
-        <w:rPr>
-          <w:rFonts w:hint="eastAsia"/>
-        </w:rPr>
-      </w:pPr>
-    </w:p>
-    <w:p>
-      <w:r>
-        <w:rPr>
-          <w:rFonts w:hint="eastAsia"/>
-        </w:rPr>
-        <w:t>교섭:</w:t>
-      </w:r>
-    </w:p>
-    <w:p>
-      <w:r>
-        <w:rPr>
-          <w:rFonts w:hint="eastAsia"/>
-        </w:rPr>
-        <w:t>주요 능력치: 지능</w:t>
       </w:r>
     </w:p>
     <w:p/>
@@ -1603,7 +1187,15 @@
         <w:rPr>
           <w:rFonts w:hint="eastAsia"/>
         </w:rPr>
-        <w:t>일일 소득: 목록 내에서 랜덤으로 1개 생성</w:t>
+        <w:t>요인 사살:</w:t>
+      </w:r>
+    </w:p>
+    <w:p>
+      <w:r>
+        <w:rPr>
+          <w:rFonts w:hint="eastAsia"/>
+        </w:rPr>
+        <w:t>주요 능력치: 힘+민첩</w:t>
       </w:r>
     </w:p>
     <w:p/>
@@ -1612,7 +1204,7 @@
         <w:rPr>
           <w:rFonts w:hint="eastAsia"/>
         </w:rPr>
-        <w:t xml:space="preserve">거리 공연: </w:t>
+        <w:t>교섭:</w:t>
       </w:r>
     </w:p>
     <w:p>
@@ -1620,7 +1212,7 @@
         <w:rPr>
           <w:rFonts w:hint="eastAsia"/>
         </w:rPr>
-        <w:t>주요 능력치: 매력</w:t>
+        <w:t>주요 능력치: 지능</w:t>
       </w:r>
     </w:p>
     <w:p/>
@@ -1629,15 +1221,7 @@
         <w:rPr>
           <w:rFonts w:hint="eastAsia"/>
         </w:rPr>
-        <w:t>행상:</w:t>
-      </w:r>
-    </w:p>
-    <w:p>
-      <w:r>
-        <w:rPr>
-          <w:rFonts w:hint="eastAsia"/>
-        </w:rPr>
-        <w:t>주요 능력치: 지능</w:t>
+        <w:t>일일 소득: 목록 내에서 랜덤으로 1개 생성</w:t>
       </w:r>
     </w:p>
     <w:p/>
@@ -1646,7 +1230,7 @@
         <w:rPr>
           <w:rFonts w:hint="eastAsia"/>
         </w:rPr>
-        <w:t>일일 아르바이트</w:t>
+        <w:t xml:space="preserve">거리 공연: </w:t>
       </w:r>
     </w:p>
     <w:p>
@@ -1654,15 +1238,44 @@
         <w:rPr>
           <w:rFonts w:hint="eastAsia"/>
         </w:rPr>
-        <w:t>주요 능력치: 체력</w:t>
+        <w:t>주요 능력치: 매력</w:t>
+      </w:r>
+    </w:p>
+    <w:p/>
+    <w:p>
+      <w:r>
+        <w:rPr>
+          <w:rFonts w:hint="eastAsia"/>
+        </w:rPr>
+        <w:t>행상:</w:t>
       </w:r>
     </w:p>
     <w:p>
-      <w:pPr>
-        <w:rPr>
-          <w:rFonts w:hint="eastAsia"/>
-        </w:rPr>
-      </w:pPr>
+      <w:r>
+        <w:rPr>
+          <w:rFonts w:hint="eastAsia"/>
+        </w:rPr>
+        <w:t>주요 능력치: 지능</w:t>
+      </w:r>
+    </w:p>
+    <w:p/>
+    <w:p>
+      <w:r>
+        <w:rPr>
+          <w:rFonts w:hint="eastAsia"/>
+        </w:rPr>
+        <w:t>일일 아르바이트</w:t>
+      </w:r>
+    </w:p>
+    <w:p>
+      <w:r>
+        <w:rPr>
+          <w:rFonts w:hint="eastAsia"/>
+        </w:rPr>
+        <w:t>주요 능력치: 체력</w:t>
+      </w:r>
+    </w:p>
+    <w:p>
       <w:r>
         <w:rPr>
           <w:rFonts w:hint="eastAsia"/>
@@ -1689,6 +1302,67 @@
           <w:rFonts w:hint="eastAsia"/>
         </w:rPr>
         <w:t xml:space="preserve"> 실패</w:t>
+      </w:r>
+    </w:p>
+    <w:p/>
+    <w:p>
+      <w:r>
+        <w:rPr>
+          <w:rFonts w:hint="eastAsia"/>
+        </w:rPr>
+        <w:t>기본</w:t>
+      </w:r>
+      <w:r>
+        <w:t xml:space="preserve"> 피해 = 주 </w:t>
+      </w:r>
+      <w:proofErr w:type="spellStart"/>
+      <w:r>
+        <w:t>스탯</w:t>
+      </w:r>
+      <w:proofErr w:type="spellEnd"/>
+      <w:r>
+        <w:t xml:space="preserve"> × 계수 × 스킬 배율</w:t>
+      </w:r>
+    </w:p>
+    <w:p/>
+    <w:p>
+      <w:r>
+        <w:rPr>
+          <w:rFonts w:hint="eastAsia"/>
+        </w:rPr>
+        <w:t>방어</w:t>
+      </w:r>
+      <w:r>
+        <w:t xml:space="preserve"> 계수 = 100 / (100 + 해당 방어력)</w:t>
+      </w:r>
+    </w:p>
+    <w:p/>
+    <w:p>
+      <w:r>
+        <w:rPr>
+          <w:rFonts w:hint="eastAsia"/>
+        </w:rPr>
+        <w:t>버프</w:t>
+      </w:r>
+      <w:r>
+        <w:t xml:space="preserve"> 피해감소율 = min(0.50, 1 - (1 - 감소율₁) × (1 - 감소율₂) × …)</w:t>
+      </w:r>
+    </w:p>
+    <w:p/>
+    <w:p>
+      <w:pPr>
+        <w:rPr>
+          <w:rFonts w:hint="eastAsia"/>
+        </w:rPr>
+      </w:pPr>
+      <w:r>
+        <w:rPr>
+          <w:rFonts w:hint="eastAsia"/>
+        </w:rPr>
+        <w:t>최종</w:t>
+      </w:r>
+      <w:r>
+        <w:t xml:space="preserve"> 피해 = 반올림(기본 피해 × 방어 계수 × (1 - 버프 피해감소율))</w:t>
       </w:r>
     </w:p>
     <w:sectPr>

</xml_diff>